<commit_message>
feat: avance con pantallas y formulario de generacion de titulos
</commit_message>
<xml_diff>
--- a/A-Documentacion/B-Elaboracion/Iteracion1-24_09-al-16_10/1-ModeloDatos/eGraduados_Elaboracion_Iteracion1_ModeloDatos.docx
+++ b/A-Documentacion/B-Elaboracion/Iteracion1-24_09-al-16_10/1-ModeloDatos/eGraduados_Elaboracion_Iteracion1_ModeloDatos.docx
@@ -6,8 +6,11 @@
       <w:sdtPr>
         <w:rPr>
           <w:rFonts w:asciiTheme="majorHAnsi" w:eastAsiaTheme="majorEastAsia" w:hAnsiTheme="majorHAnsi" w:cstheme="majorBidi"/>
+          <w:i/>
+          <w:color w:val="548DD4"/>
           <w:sz w:val="72"/>
           <w:szCs w:val="72"/>
+          <w:lang w:val="es-AR"/>
         </w:rPr>
         <w:id w:val="3224277"/>
         <w:docPartObj>
@@ -18,11 +21,8 @@
       <w:sdtEndPr>
         <w:rPr>
           <w:rFonts w:asciiTheme="minorHAnsi" w:eastAsiaTheme="minorHAnsi" w:hAnsiTheme="minorHAnsi" w:cstheme="minorBidi"/>
-          <w:i/>
-          <w:color w:val="548DD4"/>
           <w:sz w:val="22"/>
           <w:szCs w:val="22"/>
-          <w:lang w:val="es-AR"/>
         </w:rPr>
       </w:sdtEndPr>
       <w:sdtContent>
@@ -2076,9 +2076,6 @@
       <w:r>
         <w:t>El modelo de datos describe los datos que se digitalizaran, su estructura, sus características y sus restricciones</w:t>
       </w:r>
-      <w:r>
-        <w:br w:type="page"/>
-      </w:r>
     </w:p>
     <w:p>
       <w:pPr>
@@ -2086,7 +2083,6 @@
       </w:pPr>
       <w:bookmarkStart w:id="1" w:name="_Toc257618994"/>
       <w:r>
-        <w:lastRenderedPageBreak/>
         <w:t>Diseño de Datos</w:t>
       </w:r>
       <w:bookmarkEnd w:id="1"/>
@@ -2439,15 +2435,7 @@
         <w:t>[</w:t>
       </w:r>
       <w:r>
-        <w:t xml:space="preserve">Luego de adoptar alguna forma normal (primera forma normal, segunda forma normal, tercera forma normal o bien la Forma normal de Boyce-Codd (BCNF)) se debe justificar por que se </w:t>
-      </w:r>
-      <w:proofErr w:type="spellStart"/>
-      <w:r>
-        <w:t>selecciono</w:t>
-      </w:r>
-      <w:proofErr w:type="spellEnd"/>
-      <w:r>
-        <w:t xml:space="preserve"> esa forma normal y aclarar sus mejo</w:t>
+        <w:t>Luego de adoptar alguna forma normal (primera forma normal, segunda forma normal, tercera forma normal o bien la Forma normal de Boyce-Codd (BCNF)) se debe justificar por que se selecciono esa forma normal y aclarar sus mejo</w:t>
       </w:r>
       <w:r>
         <w:t>rías hacia el modelo relacional</w:t>

</xml_diff>